<commit_message>
docs(sow): AMC at 22% per annum, billed half-yearly in advance
Reset the AMC commercial in CLIENT_SOW.md (and regenerated the .docx) to
the industry-standard structure: 22% of total project cost per annum,
invoiced half-yearly in advance.

For the ₹37L sub-total this works out to:
- Annual AMC fee (ex-GST): ₹8,14,000
- Half-yearly instalment (ex-GST): ₹4,07,000

Updated Sections 9.1 (AMC fee table) and 9.2 (billing cadence). The
in-scope / out-of-scope lists, severity SLA and renewal clauses are
unchanged — only the fee and billing frequency moved.
</commit_message>
<xml_diff>
--- a/docs/CLIENT_SOW.docx
+++ b/docs/CLIENT_SOW.docx
@@ -6934,7 +6934,7 @@
           <w:b/>
           <w:bCs/>
         </w:rPr>
-        <w:t xml:space="preserve">10% of the total project cost, billed monthly</w:t>
+        <w:t xml:space="preserve">22% of the total project cost per annum, billed half-yearly in advance</w:t>
       </w:r>
       <w:r>
         <w:t xml:space="preserve">, for the duration of the AMC period.</w:t>
@@ -7011,7 +7011,7 @@
               <w:pStyle w:val="Compact"/>
             </w:pPr>
             <w:r>
-              <w:t xml:space="preserve">AMC rate (per month)</w:t>
+              <w:t xml:space="preserve">AMC rate</w:t>
             </w:r>
           </w:p>
         </w:tc>
@@ -7023,7 +7023,7 @@
               <w:jc w:val="right"/>
             </w:pPr>
             <w:r>
-              <w:t xml:space="preserve">10% of project cost</w:t>
+              <w:t xml:space="preserve">22% of project cost per annum</w:t>
             </w:r>
           </w:p>
         </w:tc>
@@ -7040,7 +7040,7 @@
                 <w:b/>
                 <w:bCs/>
               </w:rPr>
-              <w:t xml:space="preserve">Monthly AMC fee (excl. GST)</w:t>
+              <w:t xml:space="preserve">Annual AMC fee (excl. GST)</w:t>
             </w:r>
           </w:p>
         </w:tc>
@@ -7056,7 +7056,7 @@
                 <w:b/>
                 <w:bCs/>
               </w:rPr>
-              <w:t xml:space="preserve">3,70,000</w:t>
+              <w:t xml:space="preserve">8,14,000</w:t>
             </w:r>
           </w:p>
         </w:tc>
@@ -7069,7 +7069,11 @@
               <w:pStyle w:val="Compact"/>
             </w:pPr>
             <w:r>
-              <w:t xml:space="preserve">Annual AMC obligation (12 months, excl. GST)</w:t>
+              <w:rPr>
+                <w:b/>
+                <w:bCs/>
+              </w:rPr>
+              <w:t xml:space="preserve">Half-yearly AMC instalment (excl. GST)</w:t>
             </w:r>
           </w:p>
         </w:tc>
@@ -7081,7 +7085,11 @@
               <w:jc w:val="right"/>
             </w:pPr>
             <w:r>
-              <w:t xml:space="preserve">44,40,000</w:t>
+              <w:rPr>
+                <w:b/>
+                <w:bCs/>
+              </w:rPr>
+              <w:t xml:space="preserve">4,07,000</w:t>
             </w:r>
           </w:p>
         </w:tc>
@@ -7092,7 +7100,7 @@
         <w:pStyle w:val="BodyText"/>
       </w:pPr>
       <w:r>
-        <w:t xml:space="preserve">GST @ 18% is applicable on every monthly AMC invoice.</w:t>
+        <w:t xml:space="preserve">GST @ 18% is applicable on every half-yearly AMC invoice.</w:t>
       </w:r>
     </w:p>
     <w:bookmarkEnd w:id="77"/>
@@ -7151,7 +7159,7 @@
         </w:numPr>
       </w:pPr>
       <w:r>
-        <w:t xml:space="preserve">AMC invoices are issued monthly in advance, payable within 7 days.</w:t>
+        <w:t xml:space="preserve">AMC invoices are issued half-yearly in advance, payable within 7 days of invoice date.</w:t>
       </w:r>
     </w:p>
     <w:bookmarkEnd w:id="78"/>

</xml_diff>